<commit_message>
FIxed and aesthetically resumed, lol :)
</commit_message>
<xml_diff>
--- a/Cover Letter - Christopher Lee Cajes.docx
+++ b/Cover Letter - Christopher Lee Cajes.docx
@@ -4,57 +4,63 @@
   <w:body>
     <w:p>
       <w:r>
-        <w:t>Good day,</w:t>
+        <w:t>Christopher Lee Cajes</w:t>
+      </w:r>
+    </w:p>
+    <w:p>
+      <w:r>
+        <w:t>Philippines</w:t>
+      </w:r>
+    </w:p>
+    <w:p>
+      <w:r>
+        <w:t>clcajes@gmail.com | +63 968 581 6796</w:t>
       </w:r>
     </w:p>
     <w:p/>
     <w:p>
       <w:r>
-        <w:t>I am writing to apply for the position that you have posted. I am interested in this opportunity and would like to be considered.</w:t>
+        <w:t>[Date]</w:t>
       </w:r>
     </w:p>
     <w:p/>
     <w:p>
       <w:r>
-        <w:t>I am currently looking for an entry-level role where I can learn and improve my skills while contributing to the team. I am willing to undergo training and follow company standards. I am comfortable working remotely.</w:t>
+        <w:t>[Hiring Manager Name]</w:t>
+      </w:r>
+    </w:p>
+    <w:p>
+      <w:r>
+        <w:t>[Company Name]</w:t>
       </w:r>
     </w:p>
     <w:p/>
     <w:p>
       <w:r>
-        <w:t>I am motivated to learn, open to feedback, and able to follow instructions carefully. I am also willing to handle different tasks as needed.</w:t>
+        <w:t>Dear Hiring Manager,</w:t>
       </w:r>
     </w:p>
     <w:p/>
     <w:p>
       <w:r>
-        <w:t>I also would like to share with you my creative resume website that also contains the applications that I have made:</w:t>
+        <w:t>I am writing to express my interest in the Senior Software Developer position at your company. With over 8 years of experience in full-stack software development, I am confident in my ability to contribute effectively to your team and deliver high-quality solutions.</w:t>
       </w:r>
-      <w:r>
-        <w:br/>
-      </w:r>
-      <w:r>
-        <w:br/>
-      </w:r>
-      <w:hyperlink r:id="rId4" w:history="1">
-        <w:r>
-          <w:rPr>
-            <w:rStyle w:val="Hyperlink"/>
-          </w:rPr>
-          <w:t>https://chris654cajes.github.io/Chris654Cajes-myresume.github.io</w:t>
-        </w:r>
-        <w:r>
-          <w:rPr>
-            <w:rStyle w:val="Hyperlink"/>
-          </w:rPr>
-          <w:t>/</w:t>
-        </w:r>
-      </w:hyperlink>
     </w:p>
     <w:p/>
     <w:p>
       <w:r>
-        <w:t>Thank you for taking the time to review my application. I am available for further discussion if required.</w:t>
+        <w:t>I have developed a portfolio website that showcases the applications I have built, along with user manuals for each project. This provides a comprehensive view of my technical capabilities and approach to software development. You may view my work at the following link:</w:t>
+      </w:r>
+    </w:p>
+    <w:p>
+      <w:r>
+        <w:t>http://www.my-creative-apps.somee.com/</w:t>
+      </w:r>
+    </w:p>
+    <w:p/>
+    <w:p>
+      <w:r>
+        <w:t>I would welcome the opportunity to discuss how my skills and experience align with your team’s needs. Thank you for your time and consideration.</w:t>
       </w:r>
     </w:p>
     <w:p/>
@@ -68,9 +74,6 @@
         <w:t>Christopher Lee Cajes</w:t>
       </w:r>
     </w:p>
-    <w:p/>
-    <w:p/>
-    <w:p/>
     <w:sectPr>
       <w:pgSz w:w="12240" w:h="15840"/>
       <w:pgMar w:top="1440" w:right="1440" w:bottom="1440" w:left="1440" w:header="720" w:footer="720" w:gutter="0"/>
@@ -489,7 +492,7 @@
     <w:link w:val="Heading1Char"/>
     <w:uiPriority w:val="9"/>
     <w:qFormat/>
-    <w:rsid w:val="00255DCA"/>
+    <w:rsid w:val="00D9739C"/>
     <w:pPr>
       <w:keepNext/>
       <w:keepLines/>
@@ -512,7 +515,7 @@
     <w:semiHidden/>
     <w:unhideWhenUsed/>
     <w:qFormat/>
-    <w:rsid w:val="00255DCA"/>
+    <w:rsid w:val="00D9739C"/>
     <w:pPr>
       <w:keepNext/>
       <w:keepLines/>
@@ -535,7 +538,7 @@
     <w:semiHidden/>
     <w:unhideWhenUsed/>
     <w:qFormat/>
-    <w:rsid w:val="00255DCA"/>
+    <w:rsid w:val="00D9739C"/>
     <w:pPr>
       <w:keepNext/>
       <w:keepLines/>
@@ -558,7 +561,7 @@
     <w:semiHidden/>
     <w:unhideWhenUsed/>
     <w:qFormat/>
-    <w:rsid w:val="00255DCA"/>
+    <w:rsid w:val="00D9739C"/>
     <w:pPr>
       <w:keepNext/>
       <w:keepLines/>
@@ -581,7 +584,7 @@
     <w:semiHidden/>
     <w:unhideWhenUsed/>
     <w:qFormat/>
-    <w:rsid w:val="00255DCA"/>
+    <w:rsid w:val="00D9739C"/>
     <w:pPr>
       <w:keepNext/>
       <w:keepLines/>
@@ -602,7 +605,7 @@
     <w:semiHidden/>
     <w:unhideWhenUsed/>
     <w:qFormat/>
-    <w:rsid w:val="00255DCA"/>
+    <w:rsid w:val="00D9739C"/>
     <w:pPr>
       <w:keepNext/>
       <w:keepLines/>
@@ -625,7 +628,7 @@
     <w:semiHidden/>
     <w:unhideWhenUsed/>
     <w:qFormat/>
-    <w:rsid w:val="00255DCA"/>
+    <w:rsid w:val="00D9739C"/>
     <w:pPr>
       <w:keepNext/>
       <w:keepLines/>
@@ -646,7 +649,7 @@
     <w:semiHidden/>
     <w:unhideWhenUsed/>
     <w:qFormat/>
-    <w:rsid w:val="00255DCA"/>
+    <w:rsid w:val="00D9739C"/>
     <w:pPr>
       <w:keepNext/>
       <w:keepLines/>
@@ -669,7 +672,7 @@
     <w:semiHidden/>
     <w:unhideWhenUsed/>
     <w:qFormat/>
-    <w:rsid w:val="00255DCA"/>
+    <w:rsid w:val="00D9739C"/>
     <w:pPr>
       <w:keepNext/>
       <w:keepLines/>
@@ -713,7 +716,7 @@
     <w:basedOn w:val="DefaultParagraphFont"/>
     <w:link w:val="Heading1"/>
     <w:uiPriority w:val="9"/>
-    <w:rsid w:val="00255DCA"/>
+    <w:rsid w:val="00D9739C"/>
     <w:rPr>
       <w:rFonts w:asciiTheme="majorHAnsi" w:eastAsiaTheme="majorEastAsia" w:hAnsiTheme="majorHAnsi" w:cstheme="majorBidi"/>
       <w:color w:val="0F4761" w:themeColor="accent1" w:themeShade="BF"/>
@@ -727,7 +730,7 @@
     <w:link w:val="Heading2"/>
     <w:uiPriority w:val="9"/>
     <w:semiHidden/>
-    <w:rsid w:val="00255DCA"/>
+    <w:rsid w:val="00D9739C"/>
     <w:rPr>
       <w:rFonts w:asciiTheme="majorHAnsi" w:eastAsiaTheme="majorEastAsia" w:hAnsiTheme="majorHAnsi" w:cstheme="majorBidi"/>
       <w:color w:val="0F4761" w:themeColor="accent1" w:themeShade="BF"/>
@@ -741,7 +744,7 @@
     <w:link w:val="Heading3"/>
     <w:uiPriority w:val="9"/>
     <w:semiHidden/>
-    <w:rsid w:val="00255DCA"/>
+    <w:rsid w:val="00D9739C"/>
     <w:rPr>
       <w:rFonts w:eastAsiaTheme="majorEastAsia" w:cstheme="majorBidi"/>
       <w:color w:val="0F4761" w:themeColor="accent1" w:themeShade="BF"/>
@@ -755,7 +758,7 @@
     <w:link w:val="Heading4"/>
     <w:uiPriority w:val="9"/>
     <w:semiHidden/>
-    <w:rsid w:val="00255DCA"/>
+    <w:rsid w:val="00D9739C"/>
     <w:rPr>
       <w:rFonts w:eastAsiaTheme="majorEastAsia" w:cstheme="majorBidi"/>
       <w:i/>
@@ -769,7 +772,7 @@
     <w:link w:val="Heading5"/>
     <w:uiPriority w:val="9"/>
     <w:semiHidden/>
-    <w:rsid w:val="00255DCA"/>
+    <w:rsid w:val="00D9739C"/>
     <w:rPr>
       <w:rFonts w:eastAsiaTheme="majorEastAsia" w:cstheme="majorBidi"/>
       <w:color w:val="0F4761" w:themeColor="accent1" w:themeShade="BF"/>
@@ -781,7 +784,7 @@
     <w:link w:val="Heading6"/>
     <w:uiPriority w:val="9"/>
     <w:semiHidden/>
-    <w:rsid w:val="00255DCA"/>
+    <w:rsid w:val="00D9739C"/>
     <w:rPr>
       <w:rFonts w:eastAsiaTheme="majorEastAsia" w:cstheme="majorBidi"/>
       <w:i/>
@@ -795,7 +798,7 @@
     <w:link w:val="Heading7"/>
     <w:uiPriority w:val="9"/>
     <w:semiHidden/>
-    <w:rsid w:val="00255DCA"/>
+    <w:rsid w:val="00D9739C"/>
     <w:rPr>
       <w:rFonts w:eastAsiaTheme="majorEastAsia" w:cstheme="majorBidi"/>
       <w:color w:val="595959" w:themeColor="text1" w:themeTint="A6"/>
@@ -807,7 +810,7 @@
     <w:link w:val="Heading8"/>
     <w:uiPriority w:val="9"/>
     <w:semiHidden/>
-    <w:rsid w:val="00255DCA"/>
+    <w:rsid w:val="00D9739C"/>
     <w:rPr>
       <w:rFonts w:eastAsiaTheme="majorEastAsia" w:cstheme="majorBidi"/>
       <w:i/>
@@ -821,7 +824,7 @@
     <w:link w:val="Heading9"/>
     <w:uiPriority w:val="9"/>
     <w:semiHidden/>
-    <w:rsid w:val="00255DCA"/>
+    <w:rsid w:val="00D9739C"/>
     <w:rPr>
       <w:rFonts w:eastAsiaTheme="majorEastAsia" w:cstheme="majorBidi"/>
       <w:color w:val="272727" w:themeColor="text1" w:themeTint="D8"/>
@@ -834,7 +837,7 @@
     <w:link w:val="TitleChar"/>
     <w:uiPriority w:val="10"/>
     <w:qFormat/>
-    <w:rsid w:val="00255DCA"/>
+    <w:rsid w:val="00D9739C"/>
     <w:pPr>
       <w:spacing w:after="80" w:line="240" w:lineRule="auto"/>
       <w:contextualSpacing/>
@@ -852,7 +855,7 @@
     <w:basedOn w:val="DefaultParagraphFont"/>
     <w:link w:val="Title"/>
     <w:uiPriority w:val="10"/>
-    <w:rsid w:val="00255DCA"/>
+    <w:rsid w:val="00D9739C"/>
     <w:rPr>
       <w:rFonts w:asciiTheme="majorHAnsi" w:eastAsiaTheme="majorEastAsia" w:hAnsiTheme="majorHAnsi" w:cstheme="majorBidi"/>
       <w:spacing w:val="-10"/>
@@ -868,7 +871,7 @@
     <w:link w:val="SubtitleChar"/>
     <w:uiPriority w:val="11"/>
     <w:qFormat/>
-    <w:rsid w:val="00255DCA"/>
+    <w:rsid w:val="00D9739C"/>
     <w:pPr>
       <w:numPr>
         <w:ilvl w:val="1"/>
@@ -887,7 +890,7 @@
     <w:basedOn w:val="DefaultParagraphFont"/>
     <w:link w:val="Subtitle"/>
     <w:uiPriority w:val="11"/>
-    <w:rsid w:val="00255DCA"/>
+    <w:rsid w:val="00D9739C"/>
     <w:rPr>
       <w:rFonts w:eastAsiaTheme="majorEastAsia" w:cstheme="majorBidi"/>
       <w:color w:val="595959" w:themeColor="text1" w:themeTint="A6"/>
@@ -903,7 +906,7 @@
     <w:link w:val="QuoteChar"/>
     <w:uiPriority w:val="29"/>
     <w:qFormat/>
-    <w:rsid w:val="00255DCA"/>
+    <w:rsid w:val="00D9739C"/>
     <w:pPr>
       <w:spacing w:before="160"/>
       <w:jc w:val="center"/>
@@ -919,7 +922,7 @@
     <w:basedOn w:val="DefaultParagraphFont"/>
     <w:link w:val="Quote"/>
     <w:uiPriority w:val="29"/>
-    <w:rsid w:val="00255DCA"/>
+    <w:rsid w:val="00D9739C"/>
     <w:rPr>
       <w:i/>
       <w:iCs/>
@@ -931,7 +934,7 @@
     <w:basedOn w:val="Normal"/>
     <w:uiPriority w:val="34"/>
     <w:qFormat/>
-    <w:rsid w:val="00255DCA"/>
+    <w:rsid w:val="00D9739C"/>
     <w:pPr>
       <w:ind w:left="720"/>
       <w:contextualSpacing/>
@@ -942,7 +945,7 @@
     <w:basedOn w:val="DefaultParagraphFont"/>
     <w:uiPriority w:val="21"/>
     <w:qFormat/>
-    <w:rsid w:val="00255DCA"/>
+    <w:rsid w:val="00D9739C"/>
     <w:rPr>
       <w:i/>
       <w:iCs/>
@@ -956,7 +959,7 @@
     <w:link w:val="IntenseQuoteChar"/>
     <w:uiPriority w:val="30"/>
     <w:qFormat/>
-    <w:rsid w:val="00255DCA"/>
+    <w:rsid w:val="00D9739C"/>
     <w:pPr>
       <w:pBdr>
         <w:top w:val="single" w:sz="4" w:space="10" w:color="0F4761" w:themeColor="accent1" w:themeShade="BF"/>
@@ -977,7 +980,7 @@
     <w:basedOn w:val="DefaultParagraphFont"/>
     <w:link w:val="IntenseQuote"/>
     <w:uiPriority w:val="30"/>
-    <w:rsid w:val="00255DCA"/>
+    <w:rsid w:val="00D9739C"/>
     <w:rPr>
       <w:i/>
       <w:iCs/>
@@ -989,36 +992,13 @@
     <w:basedOn w:val="DefaultParagraphFont"/>
     <w:uiPriority w:val="32"/>
     <w:qFormat/>
-    <w:rsid w:val="00255DCA"/>
+    <w:rsid w:val="00D9739C"/>
     <w:rPr>
       <w:b/>
       <w:bCs/>
       <w:smallCaps/>
       <w:color w:val="0F4761" w:themeColor="accent1" w:themeShade="BF"/>
       <w:spacing w:val="5"/>
-    </w:rPr>
-  </w:style>
-  <w:style w:type="character" w:styleId="Hyperlink">
-    <w:name w:val="Hyperlink"/>
-    <w:basedOn w:val="DefaultParagraphFont"/>
-    <w:uiPriority w:val="99"/>
-    <w:unhideWhenUsed/>
-    <w:rsid w:val="009A4B37"/>
-    <w:rPr>
-      <w:color w:val="467886" w:themeColor="hyperlink"/>
-      <w:u w:val="single"/>
-    </w:rPr>
-  </w:style>
-  <w:style w:type="character" w:styleId="UnresolvedMention">
-    <w:name w:val="Unresolved Mention"/>
-    <w:basedOn w:val="DefaultParagraphFont"/>
-    <w:uiPriority w:val="99"/>
-    <w:semiHidden/>
-    <w:unhideWhenUsed/>
-    <w:rsid w:val="009A4B37"/>
-    <w:rPr>
-      <w:color w:val="605E5C"/>
-      <w:shd w:val="clear" w:color="auto" w:fill="E1DFDD"/>
     </w:rPr>
   </w:style>
 </w:styles>

</xml_diff>